<commit_message>
fix: update pink buttons and unpaid badges to solid red
</commit_message>
<xml_diff>
--- a/Functional_Areas_Table.docx
+++ b/Functional_Areas_Table.docx
@@ -7,6 +7,8 @@
         <w:jc w:val="center"/>
         <w:rPr>
           <w:rFonts w:ascii="Times New Roman" w:hAnsi="Times New Roman" w:cs="Times New Roman"/>
+          <w:sz w:val="24"/>
+          <w:szCs w:val="24"/>
         </w:rPr>
       </w:pPr>
       <w:r>
@@ -14,7 +16,8 @@
           <w:rFonts w:ascii="Times New Roman" w:hAnsi="Times New Roman" w:cs="Times New Roman"/>
           <w:b/>
           <w:color w:val="0F172A"/>
-          <w:sz w:val="28"/>
+          <w:sz w:val="32"/>
+          <w:szCs w:val="24"/>
         </w:rPr>
         <w:t>HOUR WASH LAUNDRY SHOP MANAGEMENT SYSTEM</w:t>
       </w:r>
@@ -23,63 +26,25 @@
           <w:rFonts w:ascii="Times New Roman" w:hAnsi="Times New Roman" w:cs="Times New Roman"/>
           <w:b/>
           <w:color w:val="0F172A"/>
-          <w:sz w:val="28"/>
+          <w:sz w:val="32"/>
+          <w:szCs w:val="24"/>
         </w:rPr>
         <w:br/>
-        <w:t xml:space="preserve">FUNCTIONAL AREAS </w:t>
-      </w:r>
-    </w:p>
-    <w:p>
-      <w:pPr>
-        <w:jc w:val="center"/>
-        <w:rPr>
-          <w:rFonts w:ascii="Times New Roman" w:hAnsi="Times New Roman" w:cs="Times New Roman"/>
-        </w:rPr>
-      </w:pPr>
-      <w:r>
-        <w:rPr>
-          <w:rFonts w:ascii="Times New Roman" w:hAnsi="Times New Roman" w:cs="Times New Roman"/>
-          <w:color w:val="475569"/>
-          <w:sz w:val="19"/>
-        </w:rPr>
-        <w:t xml:space="preserve">Subject: Supply Chain </w:t>
+        <w:t>FUNCTIONAL AREAS OF OPERATION TABLE</w:t>
       </w:r>
       <w:r>
         <w:rPr>
           <w:rFonts w:ascii="Times New Roman" w:hAnsi="Times New Roman" w:cs="Times New Roman"/>
           <w:color w:val="475569"/>
-          <w:sz w:val="19"/>
-        </w:rPr>
-        <w:t>Management |</w:t>
-      </w:r>
-      <w:r>
-        <w:rPr>
-          <w:rFonts w:ascii="Times New Roman" w:hAnsi="Times New Roman" w:cs="Times New Roman"/>
-          <w:color w:val="475569"/>
-          <w:sz w:val="19"/>
-        </w:rPr>
-        <w:t xml:space="preserve">  Course &amp; Block: BSIT-4A</w:t>
-      </w:r>
-      <w:r>
-        <w:rPr>
-          <w:rFonts w:ascii="Times New Roman" w:hAnsi="Times New Roman" w:cs="Times New Roman"/>
-          <w:color w:val="475569"/>
-          <w:sz w:val="19"/>
+          <w:szCs w:val="24"/>
         </w:rPr>
         <w:br/>
         <w:t>Group Members: Shayne Marie Formento, Karl Nicko Alondra, Lezil Orgasa, Alexa Cas</w:t>
       </w:r>
     </w:p>
-    <w:p>
-      <w:pPr>
-        <w:rPr>
-          <w:rFonts w:ascii="Times New Roman" w:hAnsi="Times New Roman" w:cs="Times New Roman"/>
-        </w:rPr>
-      </w:pPr>
-    </w:p>
     <w:tbl>
       <w:tblPr>
-        <w:tblW w:w="0" w:type="auto"/>
+        <w:tblW w:w="10504" w:type="dxa"/>
         <w:jc w:val="center"/>
         <w:tblBorders>
           <w:top w:val="single" w:sz="6" w:space="0" w:color="475569"/>
@@ -92,19 +57,19 @@
         <w:tblLook w:val="04A0" w:firstRow="1" w:lastRow="0" w:firstColumn="1" w:lastColumn="0" w:noHBand="0" w:noVBand="1"/>
       </w:tblPr>
       <w:tblGrid>
-        <w:gridCol w:w="713"/>
-        <w:gridCol w:w="2855"/>
-        <w:gridCol w:w="3848"/>
-        <w:gridCol w:w="3008"/>
+        <w:gridCol w:w="717"/>
+        <w:gridCol w:w="2877"/>
+        <w:gridCol w:w="3879"/>
+        <w:gridCol w:w="3031"/>
       </w:tblGrid>
       <w:tr>
         <w:trPr>
+          <w:trHeight w:val="719"/>
           <w:jc w:val="center"/>
         </w:trPr>
         <w:tc>
           <w:tcPr>
-            <w:tcW w:w="720" w:type="dxa"/>
-            <w:shd w:val="clear" w:color="auto" w:fill="000000" w:themeFill="text1"/>
+            <w:tcW w:w="717" w:type="dxa"/>
             <w:tcMar>
               <w:top w:w="140" w:type="dxa"/>
               <w:left w:w="100" w:type="dxa"/>
@@ -117,23 +82,25 @@
               <w:jc w:val="center"/>
               <w:rPr>
                 <w:rFonts w:ascii="Times New Roman" w:hAnsi="Times New Roman" w:cs="Times New Roman"/>
+                <w:color w:val="000000" w:themeColor="text1"/>
+                <w:sz w:val="18"/>
+                <w:szCs w:val="20"/>
               </w:rPr>
             </w:pPr>
             <w:r>
               <w:rPr>
                 <w:rFonts w:ascii="Times New Roman" w:hAnsi="Times New Roman" w:cs="Times New Roman"/>
-                <w:b/>
-                <w:color w:val="FFFFFF"/>
-                <w:sz w:val="19"/>
+                <w:color w:val="000000" w:themeColor="text1"/>
+                <w:sz w:val="18"/>
+                <w:szCs w:val="20"/>
               </w:rPr>
-              <w:t>#</w:t>
+              <w:t>NO.</w:t>
             </w:r>
           </w:p>
         </w:tc>
         <w:tc>
           <w:tcPr>
-            <w:tcW w:w="2880" w:type="dxa"/>
-            <w:shd w:val="clear" w:color="auto" w:fill="000000" w:themeFill="text1"/>
+            <w:tcW w:w="2877" w:type="dxa"/>
             <w:tcMar>
               <w:top w:w="140" w:type="dxa"/>
               <w:left w:w="100" w:type="dxa"/>
@@ -145,14 +112,18 @@
             <w:pPr>
               <w:rPr>
                 <w:rFonts w:ascii="Times New Roman" w:hAnsi="Times New Roman" w:cs="Times New Roman"/>
+                <w:color w:val="000000" w:themeColor="text1"/>
+                <w:sz w:val="18"/>
+                <w:szCs w:val="20"/>
               </w:rPr>
             </w:pPr>
             <w:r>
               <w:rPr>
                 <w:rFonts w:ascii="Times New Roman" w:hAnsi="Times New Roman" w:cs="Times New Roman"/>
                 <w:b/>
-                <w:color w:val="FFFFFF"/>
-                <w:sz w:val="19"/>
+                <w:color w:val="000000" w:themeColor="text1"/>
+                <w:sz w:val="18"/>
+                <w:szCs w:val="20"/>
               </w:rPr>
               <w:t>Functional Area of Operation</w:t>
             </w:r>
@@ -160,8 +131,7 @@
         </w:tc>
         <w:tc>
           <w:tcPr>
-            <w:tcW w:w="3888" w:type="dxa"/>
-            <w:shd w:val="clear" w:color="auto" w:fill="000000" w:themeFill="text1"/>
+            <w:tcW w:w="3879" w:type="dxa"/>
             <w:tcMar>
               <w:top w:w="140" w:type="dxa"/>
               <w:left w:w="100" w:type="dxa"/>
@@ -173,14 +143,18 @@
             <w:pPr>
               <w:rPr>
                 <w:rFonts w:ascii="Times New Roman" w:hAnsi="Times New Roman" w:cs="Times New Roman"/>
+                <w:color w:val="000000" w:themeColor="text1"/>
+                <w:sz w:val="18"/>
+                <w:szCs w:val="20"/>
               </w:rPr>
             </w:pPr>
             <w:r>
               <w:rPr>
                 <w:rFonts w:ascii="Times New Roman" w:hAnsi="Times New Roman" w:cs="Times New Roman"/>
                 <w:b/>
-                <w:color w:val="FFFFFF"/>
-                <w:sz w:val="19"/>
+                <w:color w:val="000000" w:themeColor="text1"/>
+                <w:sz w:val="18"/>
+                <w:szCs w:val="20"/>
               </w:rPr>
               <w:t>Operational Domain Scope &amp; Responsibilities</w:t>
             </w:r>
@@ -188,8 +162,7 @@
         </w:tc>
         <w:tc>
           <w:tcPr>
-            <w:tcW w:w="3024" w:type="dxa"/>
-            <w:shd w:val="clear" w:color="auto" w:fill="000000" w:themeFill="text1"/>
+            <w:tcW w:w="3031" w:type="dxa"/>
             <w:tcMar>
               <w:top w:w="140" w:type="dxa"/>
               <w:left w:w="100" w:type="dxa"/>
@@ -201,14 +174,18 @@
             <w:pPr>
               <w:rPr>
                 <w:rFonts w:ascii="Times New Roman" w:hAnsi="Times New Roman" w:cs="Times New Roman"/>
+                <w:color w:val="000000" w:themeColor="text1"/>
+                <w:sz w:val="18"/>
+                <w:szCs w:val="20"/>
               </w:rPr>
             </w:pPr>
             <w:r>
               <w:rPr>
                 <w:rFonts w:ascii="Times New Roman" w:hAnsi="Times New Roman" w:cs="Times New Roman"/>
                 <w:b/>
-                <w:color w:val="FFFFFF"/>
-                <w:sz w:val="19"/>
+                <w:color w:val="000000" w:themeColor="text1"/>
+                <w:sz w:val="18"/>
+                <w:szCs w:val="20"/>
               </w:rPr>
               <w:t>Key System Features Covered</w:t>
             </w:r>
@@ -217,12 +194,12 @@
       </w:tr>
       <w:tr>
         <w:trPr>
+          <w:trHeight w:val="1610"/>
           <w:jc w:val="center"/>
         </w:trPr>
         <w:tc>
           <w:tcPr>
-            <w:tcW w:w="720" w:type="dxa"/>
-            <w:shd w:val="clear" w:color="auto" w:fill="FFFFFF"/>
+            <w:tcW w:w="717" w:type="dxa"/>
             <w:tcMar>
               <w:top w:w="100" w:type="dxa"/>
               <w:left w:w="100" w:type="dxa"/>
@@ -249,8 +226,7 @@
         </w:tc>
         <w:tc>
           <w:tcPr>
-            <w:tcW w:w="2880" w:type="dxa"/>
-            <w:shd w:val="clear" w:color="auto" w:fill="FFFFFF"/>
+            <w:tcW w:w="2877" w:type="dxa"/>
             <w:tcMar>
               <w:top w:w="100" w:type="dxa"/>
               <w:left w:w="100" w:type="dxa"/>
@@ -277,8 +253,7 @@
         </w:tc>
         <w:tc>
           <w:tcPr>
-            <w:tcW w:w="3888" w:type="dxa"/>
-            <w:shd w:val="clear" w:color="auto" w:fill="FFFFFF"/>
+            <w:tcW w:w="3879" w:type="dxa"/>
             <w:tcMar>
               <w:top w:w="100" w:type="dxa"/>
               <w:left w:w="100" w:type="dxa"/>
@@ -297,14 +272,20 @@
                 <w:rFonts w:ascii="Times New Roman" w:hAnsi="Times New Roman" w:cs="Times New Roman"/>
                 <w:sz w:val="18"/>
               </w:rPr>
-              <w:t>Responsible for physical store equipment management, washing machine and dryer fleet monitoring, operational status tracking (Idle, Washing, Drying, Maintenance), capacity management, and power outage brownout time extensions (+60 mins).</w:t>
+              <w:t>Responsible for physical store equipment management, washing machine and dryer fleet monitoring, operational status tracking (Idle, Washing, Drying, Maintenance), capacity management</w:t>
+            </w:r>
+            <w:r>
+              <w:rPr>
+                <w:rFonts w:ascii="Times New Roman" w:hAnsi="Times New Roman" w:cs="Times New Roman"/>
+                <w:sz w:val="18"/>
+              </w:rPr>
+              <w:t>.</w:t>
             </w:r>
           </w:p>
         </w:tc>
         <w:tc>
           <w:tcPr>
-            <w:tcW w:w="3024" w:type="dxa"/>
-            <w:shd w:val="clear" w:color="auto" w:fill="FFFFFF"/>
+            <w:tcW w:w="3031" w:type="dxa"/>
             <w:tcMar>
               <w:top w:w="100" w:type="dxa"/>
               <w:left w:w="100" w:type="dxa"/>
@@ -339,19 +320,18 @@
                 <w:sz w:val="18"/>
               </w:rPr>
               <w:br/>
-              <w:t>• Brownout Delay Extension (admin.laundry.extend)</w:t>
             </w:r>
           </w:p>
         </w:tc>
       </w:tr>
       <w:tr>
         <w:trPr>
+          <w:trHeight w:val="1844"/>
           <w:jc w:val="center"/>
         </w:trPr>
         <w:tc>
           <w:tcPr>
-            <w:tcW w:w="720" w:type="dxa"/>
-            <w:shd w:val="clear" w:color="auto" w:fill="F8FAFC"/>
+            <w:tcW w:w="717" w:type="dxa"/>
             <w:tcMar>
               <w:top w:w="100" w:type="dxa"/>
               <w:left w:w="100" w:type="dxa"/>
@@ -378,8 +358,7 @@
         </w:tc>
         <w:tc>
           <w:tcPr>
-            <w:tcW w:w="2880" w:type="dxa"/>
-            <w:shd w:val="clear" w:color="auto" w:fill="F8FAFC"/>
+            <w:tcW w:w="2877" w:type="dxa"/>
             <w:tcMar>
               <w:top w:w="100" w:type="dxa"/>
               <w:left w:w="100" w:type="dxa"/>
@@ -406,8 +385,7 @@
         </w:tc>
         <w:tc>
           <w:tcPr>
-            <w:tcW w:w="3888" w:type="dxa"/>
-            <w:shd w:val="clear" w:color="auto" w:fill="F8FAFC"/>
+            <w:tcW w:w="3879" w:type="dxa"/>
             <w:tcMar>
               <w:top w:w="100" w:type="dxa"/>
               <w:left w:w="100" w:type="dxa"/>
@@ -432,8 +410,7 @@
         </w:tc>
         <w:tc>
           <w:tcPr>
-            <w:tcW w:w="3024" w:type="dxa"/>
-            <w:shd w:val="clear" w:color="auto" w:fill="F8FAFC"/>
+            <w:tcW w:w="3031" w:type="dxa"/>
             <w:tcMar>
               <w:top w:w="100" w:type="dxa"/>
               <w:left w:w="100" w:type="dxa"/>
@@ -483,12 +460,12 @@
       </w:tr>
       <w:tr>
         <w:trPr>
+          <w:trHeight w:val="2078"/>
           <w:jc w:val="center"/>
         </w:trPr>
         <w:tc>
           <w:tcPr>
-            <w:tcW w:w="720" w:type="dxa"/>
-            <w:shd w:val="clear" w:color="auto" w:fill="FFFFFF"/>
+            <w:tcW w:w="717" w:type="dxa"/>
             <w:tcMar>
               <w:top w:w="100" w:type="dxa"/>
               <w:left w:w="100" w:type="dxa"/>
@@ -515,8 +492,7 @@
         </w:tc>
         <w:tc>
           <w:tcPr>
-            <w:tcW w:w="2880" w:type="dxa"/>
-            <w:shd w:val="clear" w:color="auto" w:fill="FFFFFF"/>
+            <w:tcW w:w="2877" w:type="dxa"/>
             <w:tcMar>
               <w:top w:w="100" w:type="dxa"/>
               <w:left w:w="100" w:type="dxa"/>
@@ -543,8 +519,7 @@
         </w:tc>
         <w:tc>
           <w:tcPr>
-            <w:tcW w:w="3888" w:type="dxa"/>
-            <w:shd w:val="clear" w:color="auto" w:fill="FFFFFF"/>
+            <w:tcW w:w="3879" w:type="dxa"/>
             <w:tcMar>
               <w:top w:w="100" w:type="dxa"/>
               <w:left w:w="100" w:type="dxa"/>
@@ -569,8 +544,7 @@
         </w:tc>
         <w:tc>
           <w:tcPr>
-            <w:tcW w:w="3024" w:type="dxa"/>
-            <w:shd w:val="clear" w:color="auto" w:fill="FFFFFF"/>
+            <w:tcW w:w="3031" w:type="dxa"/>
             <w:tcMar>
               <w:top w:w="100" w:type="dxa"/>
               <w:left w:w="100" w:type="dxa"/>
@@ -620,12 +594,12 @@
       </w:tr>
       <w:tr>
         <w:trPr>
+          <w:trHeight w:val="2078"/>
           <w:jc w:val="center"/>
         </w:trPr>
         <w:tc>
           <w:tcPr>
-            <w:tcW w:w="720" w:type="dxa"/>
-            <w:shd w:val="clear" w:color="auto" w:fill="F8FAFC"/>
+            <w:tcW w:w="717" w:type="dxa"/>
             <w:tcMar>
               <w:top w:w="100" w:type="dxa"/>
               <w:left w:w="100" w:type="dxa"/>
@@ -652,8 +626,7 @@
         </w:tc>
         <w:tc>
           <w:tcPr>
-            <w:tcW w:w="2880" w:type="dxa"/>
-            <w:shd w:val="clear" w:color="auto" w:fill="F8FAFC"/>
+            <w:tcW w:w="2877" w:type="dxa"/>
             <w:tcMar>
               <w:top w:w="100" w:type="dxa"/>
               <w:left w:w="100" w:type="dxa"/>
@@ -674,14 +647,13 @@
                 <w:color w:val="0F172A"/>
                 <w:sz w:val="18"/>
               </w:rPr>
-              <w:t>Customer Intake &amp; Delivery Services</w:t>
+              <w:t>Customer Intake &amp; Store Service Processing</w:t>
             </w:r>
           </w:p>
         </w:tc>
         <w:tc>
           <w:tcPr>
-            <w:tcW w:w="3888" w:type="dxa"/>
-            <w:shd w:val="clear" w:color="auto" w:fill="F8FAFC"/>
+            <w:tcW w:w="3879" w:type="dxa"/>
             <w:tcMar>
               <w:top w:w="100" w:type="dxa"/>
               <w:left w:w="100" w:type="dxa"/>
@@ -700,14 +672,13 @@
                 <w:rFonts w:ascii="Times New Roman" w:hAnsi="Times New Roman" w:cs="Times New Roman"/>
                 <w:sz w:val="18"/>
               </w:rPr>
-              <w:t>Operational domain covering online booking requests, walk-in cashier intake, weight verification and 7kg load limit enforcement, QR code stage tracking (Received → Washing → Drying → Ready), rider doorstep pickup and delivery dispatches, and automated SMS text notification alerts.</w:t>
+              <w:t>Operational domain covering online booking requests, walk-in cashier intake, weight verification and 7kg load limit enforcement, QR code stage tracking (Received → Washing → Drying → Ready for Store Pickup), and automated SMS text notification alerts upon completion.</w:t>
             </w:r>
           </w:p>
         </w:tc>
         <w:tc>
           <w:tcPr>
-            <w:tcW w:w="3024" w:type="dxa"/>
-            <w:shd w:val="clear" w:color="auto" w:fill="F8FAFC"/>
+            <w:tcW w:w="3031" w:type="dxa"/>
             <w:tcMar>
               <w:top w:w="100" w:type="dxa"/>
               <w:left w:w="100" w:type="dxa"/>
@@ -742,7 +713,7 @@
                 <w:sz w:val="18"/>
               </w:rPr>
               <w:br/>
-              <w:t>• Rider Logistics Console (rider/dashboard)</w:t>
+              <w:t>• Workstation Queue Console (staff/dashboard)</w:t>
             </w:r>
             <w:r>
               <w:rPr>
@@ -757,12 +728,12 @@
       </w:tr>
       <w:tr>
         <w:trPr>
+          <w:trHeight w:val="1601"/>
           <w:jc w:val="center"/>
         </w:trPr>
         <w:tc>
           <w:tcPr>
-            <w:tcW w:w="720" w:type="dxa"/>
-            <w:shd w:val="clear" w:color="auto" w:fill="FFFFFF"/>
+            <w:tcW w:w="717" w:type="dxa"/>
             <w:tcMar>
               <w:top w:w="100" w:type="dxa"/>
               <w:left w:w="100" w:type="dxa"/>
@@ -789,8 +760,7 @@
         </w:tc>
         <w:tc>
           <w:tcPr>
-            <w:tcW w:w="2880" w:type="dxa"/>
-            <w:shd w:val="clear" w:color="auto" w:fill="FFFFFF"/>
+            <w:tcW w:w="2877" w:type="dxa"/>
             <w:tcMar>
               <w:top w:w="100" w:type="dxa"/>
               <w:left w:w="100" w:type="dxa"/>
@@ -817,8 +787,7 @@
         </w:tc>
         <w:tc>
           <w:tcPr>
-            <w:tcW w:w="3888" w:type="dxa"/>
-            <w:shd w:val="clear" w:color="auto" w:fill="FFFFFF"/>
+            <w:tcW w:w="3879" w:type="dxa"/>
             <w:tcMar>
               <w:top w:w="100" w:type="dxa"/>
               <w:left w:w="100" w:type="dxa"/>
@@ -837,14 +806,13 @@
                 <w:rFonts w:ascii="Times New Roman" w:hAnsi="Times New Roman" w:cs="Times New Roman"/>
                 <w:sz w:val="18"/>
               </w:rPr>
-              <w:t>Administrative domain managing user account credentials, Role-Based Access Control (Owner, Admin, Staff, Rider, Customer), staff workstation activity tracking, QR scan audit logs, SMS/Email outbox audit trails, and system security credentials.</w:t>
+              <w:t>Administrative domain managing user account credentials, Role-Based Access Control (Admin, Staff, Customer), staff workstation activity tracking, QR scan audit logs, SMS/Email outbox audit trails, and system security credentials.</w:t>
             </w:r>
           </w:p>
         </w:tc>
         <w:tc>
           <w:tcPr>
-            <w:tcW w:w="3024" w:type="dxa"/>
-            <w:shd w:val="clear" w:color="auto" w:fill="FFFFFF"/>
+            <w:tcW w:w="3031" w:type="dxa"/>
             <w:tcMar>
               <w:top w:w="100" w:type="dxa"/>
               <w:left w:w="100" w:type="dxa"/>
@@ -1083,31 +1051,31 @@
       </w:rPr>
     </w:lvl>
   </w:abstractNum>
-  <w:num w:numId="1" w16cid:durableId="89932954">
+  <w:num w:numId="1" w16cid:durableId="1319649249">
     <w:abstractNumId w:val="8"/>
   </w:num>
-  <w:num w:numId="2" w16cid:durableId="1620795207">
+  <w:num w:numId="2" w16cid:durableId="862087472">
     <w:abstractNumId w:val="6"/>
   </w:num>
-  <w:num w:numId="3" w16cid:durableId="997264250">
+  <w:num w:numId="3" w16cid:durableId="128675116">
     <w:abstractNumId w:val="5"/>
   </w:num>
-  <w:num w:numId="4" w16cid:durableId="1204518622">
+  <w:num w:numId="4" w16cid:durableId="1723095161">
     <w:abstractNumId w:val="4"/>
   </w:num>
-  <w:num w:numId="5" w16cid:durableId="496579586">
+  <w:num w:numId="5" w16cid:durableId="126897553">
     <w:abstractNumId w:val="7"/>
   </w:num>
-  <w:num w:numId="6" w16cid:durableId="114299893">
+  <w:num w:numId="6" w16cid:durableId="1976985796">
     <w:abstractNumId w:val="3"/>
   </w:num>
-  <w:num w:numId="7" w16cid:durableId="1295216300">
+  <w:num w:numId="7" w16cid:durableId="1909068383">
     <w:abstractNumId w:val="2"/>
   </w:num>
-  <w:num w:numId="8" w16cid:durableId="789856486">
+  <w:num w:numId="8" w16cid:durableId="2115707524">
     <w:abstractNumId w:val="1"/>
   </w:num>
-  <w:num w:numId="9" w16cid:durableId="1447887637">
+  <w:num w:numId="9" w16cid:durableId="32850169">
     <w:abstractNumId w:val="0"/>
   </w:num>
 </w:numbering>

</xml_diff>